<commit_message>
Put the student name and id on every document cover
Suphawat Janpaichit, 671320101. Added to the PDF cover, the report DOCX
cover, the manual DOCX cover and the presentation title slide, driven from
two constants so the four documents cannot drift apart.

Also refreshed two figures that had gone stale since the report was first
generated: 238 to 242 commits, and 247 to 274 tests.

Verified by extracting the text of the generated PDF rather than trusting the
generator: page 1 carries both lines.
</commit_message>
<xml_diff>
--- a/deliverables/คู่มือการใช้งาน.docx
+++ b/deliverables/คู่มือการใช้งาน.docx
@@ -78,6 +78,36 @@
       </w:r>
     </w:p>
     <w:p>
+      <w:pPr>
+        <w:spacing w:after="120"/>
+        <w:jc w:val="center"/>
+      </w:pPr>
+      <w:r>
+        <w:rPr>
+          <w:rFonts w:ascii="Leelawadee UI" w:hAnsi="Leelawadee UI" w:cs="Leelawadee UI" w:eastAsia="Leelawadee UI"/>
+          <w:b/>
+          <w:color w:val="0F172A"/>
+          <w:sz w:val="24"/>
+        </w:rPr>
+        <w:t>ชื่อ-นามสกุล นักศีมชา: สุภวัฒน์ จันไพิตร</w:t>
+      </w:r>
+    </w:p>
+    <w:p>
+      <w:pPr>
+        <w:spacing w:after="120"/>
+        <w:jc w:val="center"/>
+      </w:pPr>
+      <w:r>
+        <w:rPr>
+          <w:rFonts w:ascii="Leelawadee UI" w:hAnsi="Leelawadee UI" w:cs="Leelawadee UI" w:eastAsia="Leelawadee UI"/>
+          <w:b/>
+          <w:color w:val="0F172A"/>
+          <w:sz w:val="24"/>
+        </w:rPr>
+        <w:t>รหัสประจำตัวผู้เรียน: 671320101</w:t>
+      </w:r>
+    </w:p>
+    <w:p>
       <w:r>
         <w:br w:type="page"/>
       </w:r>
@@ -124,6 +154,36 @@
           <w:sz w:val="24"/>
         </w:rPr>
         <w:t>เว็บไซต์: https://yumpakjure.onrender.com/</w:t>
+      </w:r>
+    </w:p>
+    <w:p>
+      <w:pPr>
+        <w:spacing w:after="80"/>
+        <w:jc w:val="center"/>
+      </w:pPr>
+      <w:r>
+        <w:rPr>
+          <w:rFonts w:ascii="Leelawadee UI" w:hAnsi="Leelawadee UI" w:cs="Leelawadee UI" w:eastAsia="Leelawadee UI"/>
+          <w:b w:val="0"/>
+          <w:color w:val="475569"/>
+          <w:sz w:val="24"/>
+        </w:rPr>
+        <w:t>ชื่อ-นามสกุล นักศีมชา: สุภวัฒน์ จันไพิตร</w:t>
+      </w:r>
+    </w:p>
+    <w:p>
+      <w:pPr>
+        <w:spacing w:after="80"/>
+        <w:jc w:val="center"/>
+      </w:pPr>
+      <w:r>
+        <w:rPr>
+          <w:rFonts w:ascii="Leelawadee UI" w:hAnsi="Leelawadee UI" w:cs="Leelawadee UI" w:eastAsia="Leelawadee UI"/>
+          <w:b w:val="0"/>
+          <w:color w:val="475569"/>
+          <w:sz w:val="24"/>
+        </w:rPr>
+        <w:t>รหัสประจำตัวผู้เรียน: 671320101</w:t>
       </w:r>
     </w:p>
     <w:p>

</xml_diff>

<commit_message>
Correct the student surname in the submitted documents
Co-Authored-By: Claude Opus 4.8 (1M context) <noreply@anthropic.com>
</commit_message>
<xml_diff>
--- a/deliverables/คู่มือการใช้งาน.docx
+++ b/deliverables/คู่มือการใช้งาน.docx
@@ -89,7 +89,7 @@
           <w:color w:val="0F172A"/>
           <w:sz w:val="24"/>
         </w:rPr>
-        <w:t>ชื่อ-นามสกุล นักศีมชา: สุภวัฒน์ จันไพิตร</w:t>
+        <w:t>ชื่อ-นามสกุล นักศีมชา: สุภวัฒน์ จันไพจิตร</w:t>
       </w:r>
     </w:p>
     <w:p>
@@ -168,7 +168,7 @@
           <w:color w:val="475569"/>
           <w:sz w:val="24"/>
         </w:rPr>
-        <w:t>ชื่อ-นามสกุล นักศีมชา: สุภวัฒน์ จันไพิตร</w:t>
+        <w:t>ชื่อ-นามสกุล นักศีมชา: สุภวัฒน์ จันไพจิตร</w:t>
       </w:r>
     </w:p>
     <w:p>
@@ -378,7 +378,7 @@
                 <w:rFonts w:ascii="Leelawadee UI" w:hAnsi="Leelawadee UI" w:cs="Leelawadee UI" w:eastAsia="Leelawadee UI"/>
                 <w:sz w:val="19"/>
               </w:rPr>
-              <w:t>11111111</w:t>
+              <w:t>12345678</w:t>
             </w:r>
           </w:p>
         </w:tc>

</xml_diff>

<commit_message>
Add the honorific prefix to the student's name in the documents
Co-Authored-By: Claude Opus 4.8 (1M context) <noreply@anthropic.com>
</commit_message>
<xml_diff>
--- a/deliverables/คู่มือการใช้งาน.docx
+++ b/deliverables/คู่มือการใช้งาน.docx
@@ -89,7 +89,7 @@
           <w:color w:val="0F172A"/>
           <w:sz w:val="24"/>
         </w:rPr>
-        <w:t>ชื่อ-นามสกุล นักศีมชา: สุภวัฒน์ จันไพจิตร</w:t>
+        <w:t>ชื่อ-นามสกุล นักศีมชา: นายสุภวัฒน์ จันไพจิตร</w:t>
       </w:r>
     </w:p>
     <w:p>
@@ -168,7 +168,7 @@
           <w:color w:val="475569"/>
           <w:sz w:val="24"/>
         </w:rPr>
-        <w:t>ชื่อ-นามสกุล นักศีมชา: สุภวัฒน์ จันไพจิตร</w:t>
+        <w:t>ชื่อ-นามสกุล นักศีมชา: นายสุภวัฒน์ จันไพจิตร</w:t>
       </w:r>
     </w:p>
     <w:p>

</xml_diff>